<commit_message>
update: brand guidelines v1.1 — studio voice, PWA positioning, engineered to last
</commit_message>
<xml_diff>
--- a/brand-guidelines/forwardslash-brand-guidelines.docx
+++ b/brand-guidelines/forwardslash-brand-guidelines.docx
@@ -82,7 +82,7 @@
           <w:sz w:val="20"/>
           <w:szCs w:val="20"/>
         </w:rPr>
-        <w:t xml:space="preserve">Version 1.0</w:t>
+        <w:t xml:space="preserve">Version 1.1</w:t>
       </w:r>
     </w:p>
     <w:p>
@@ -309,13 +309,11 @@
           <w:rFonts w:ascii="Courier New" w:cs="Courier New" w:eastAsia="Courier New" w:hAnsi="Courier New"/>
           <w:b/>
           <w:bCs/>
-          <w:i w:val="false"/>
-          <w:iCs w:val="false"/>
           <w:color w:val="0A0A0B"/>
           <w:sz w:val="24"/>
           <w:szCs w:val="24"/>
         </w:rPr>
-        <w:t xml:space="preserve">// Precision web application development. No overhead — just output.</w:t>
+        <w:t xml:space="preserve">// Precision-crafted web applications and PWAs. No gatekeepers — software your business owns outright, from the code to the distribution channel.</w:t>
       </w:r>
     </w:p>
     <w:p>
@@ -377,7 +375,7 @@
           <w:sz w:val="22"/>
           <w:szCs w:val="22"/>
         </w:rPr>
-        <w:t xml:space="preserve">Direct — Say what the work does. Skip adjectives. Clients hire results, not personality.</w:t>
+        <w:t xml:space="preserve">Direct — State the outcome clearly. Clients hire results, not methodology.</w:t>
       </w:r>
     </w:p>
     <w:p>
@@ -398,7 +396,7 @@
           <w:sz w:val="22"/>
           <w:szCs w:val="22"/>
         </w:rPr>
-        <w:t xml:space="preserve">Technical — Speak the language. The right clients will recognise and appreciate precision.</w:t>
+        <w:t xml:space="preserve">Technical — Speak the language with precision. The right clients will recognise the fluency and self-select accordingly.</w:t>
       </w:r>
     </w:p>
     <w:p>
@@ -419,7 +417,7 @@
           <w:sz w:val="22"/>
           <w:szCs w:val="22"/>
         </w:rPr>
-        <w:t xml:space="preserve">Confident — No hedging. Own the work. "I build" not "I try to help you build."</w:t>
+        <w:t xml:space="preserve">Confident — No hedging. Own the work and the expertise. Studio voice: "we build" not "we try to help you build."</w:t>
       </w:r>
     </w:p>
     <w:p>
@@ -3460,7 +3458,7 @@
           <w:sz w:val="22"/>
           <w:szCs w:val="22"/>
         </w:rPr>
-        <w:t xml:space="preserve">Forwardslash is a solo development practice. The voice should reflect that: direct, informed, and without filler. Every sentence should earn its place.</w:t>
+        <w:t xml:space="preserve">Forwardslash speaks in a studio voice — we/our throughout. The tone is direct, technically precise, and without filler. Every sentence should earn its place.</w:t>
       </w:r>
     </w:p>
     <w:p>
@@ -3496,7 +3494,7 @@
           <w:sz w:val="22"/>
           <w:szCs w:val="22"/>
         </w:rPr>
-        <w:t xml:space="preserve">State the outcome, not the process. Clients care about what gets built and how reliably it ships — not about the methodology.</w:t>
+        <w:t xml:space="preserve">State the outcome, not the process. Clients hire results, not methodology.</w:t>
       </w:r>
     </w:p>
     <w:p>
@@ -3520,7 +3518,7 @@
           <w:sz w:val="20"/>
           <w:szCs w:val="20"/>
         </w:rPr>
-        <w:t xml:space="preserve">// Good: "I build web applications. Here is what I have shipped."</w:t>
+        <w:t xml:space="preserve">// Good: "We build web applications and PWAs engineered for the long term."</w:t>
       </w:r>
     </w:p>
     <w:p>
@@ -3539,7 +3537,7 @@
           <w:sz w:val="20"/>
           <w:szCs w:val="20"/>
         </w:rPr>
-        <w:t xml:space="preserve">// Avoid: "I am passionate about leveraging modern technologies to deliver scalable solutions."</w:t>
+        <w:t xml:space="preserve">// Avoid: "We are passionate about leveraging modern technologies to deliver scalable solutions."</w:t>
       </w:r>
     </w:p>
     <w:p>
@@ -3599,7 +3597,7 @@
           <w:sz w:val="20"/>
           <w:szCs w:val="20"/>
         </w:rPr>
-        <w:t xml:space="preserve">// Good: "Full-stack TypeScript. REST and GraphQL APIs. PostgreSQL and Redis."</w:t>
+        <w:t xml:space="preserve">// Good: "Full-stack TypeScript. PWA-first. No App Store dependencies."</w:t>
       </w:r>
     </w:p>
     <w:p>
@@ -3618,7 +3616,7 @@
           <w:sz w:val="20"/>
           <w:szCs w:val="20"/>
         </w:rPr>
-        <w:t xml:space="preserve">// Avoid: "I build all kinds of web stuff for businesses of all sizes."</w:t>
+        <w:t xml:space="preserve">// Avoid: "We build all kinds of web stuff for businesses of all sizes."</w:t>
       </w:r>
     </w:p>
     <w:p>
@@ -3654,7 +3652,7 @@
           <w:sz w:val="22"/>
           <w:szCs w:val="22"/>
         </w:rPr>
-        <w:t xml:space="preserve">No hedging language. Own the work and the expertise.</w:t>
+        <w:t xml:space="preserve">No hedging language. Studio voice — we/our throughout. Own the work and the expertise.</w:t>
       </w:r>
     </w:p>
     <w:p>
@@ -3678,7 +3676,7 @@
           <w:sz w:val="20"/>
           <w:szCs w:val="20"/>
         </w:rPr>
-        <w:t xml:space="preserve">// Good: "I build. I ship. I maintain."</w:t>
+        <w:t xml:space="preserve">// Good: "We build. We ship. We maintain."</w:t>
       </w:r>
     </w:p>
     <w:p>
@@ -3697,7 +3695,7 @@
           <w:sz w:val="20"/>
           <w:szCs w:val="20"/>
         </w:rPr>
-        <w:t xml:space="preserve">// Avoid: "I try to help clients achieve their goals through collaborative development."</w:t>
+        <w:t xml:space="preserve">// Avoid: "We try to help clients achieve their goals through collaborative development."</w:t>
       </w:r>
     </w:p>
     <w:p>
@@ -3757,7 +3755,7 @@
           <w:sz w:val="20"/>
           <w:szCs w:val="20"/>
         </w:rPr>
-        <w:t xml:space="preserve">// Good: "No overhead. Just output."</w:t>
+        <w:t xml:space="preserve">// Good: "No gatekeepers. No platform tax. Just the web."</w:t>
       </w:r>
     </w:p>
     <w:p>
@@ -3776,7 +3774,7 @@
           <w:sz w:val="20"/>
           <w:szCs w:val="20"/>
         </w:rPr>
-        <w:t xml:space="preserve">// Avoid: "With years of experience and a commitment to quality, I strive to deliver..."</w:t>
+        <w:t xml:space="preserve">// Avoid: "With years of experience and a commitment to quality, we strive to deliver..."</w:t>
       </w:r>
     </w:p>
     <w:p>
@@ -3812,7 +3810,7 @@
           <w:sz w:val="22"/>
           <w:szCs w:val="22"/>
         </w:rPr>
-        <w:t xml:space="preserve">Taglines are written as code comments, using // to open. This keeps them native to the brand.</w:t>
+        <w:t xml:space="preserve">Taglines are written as code comments using // to open. The primary tagline is "// engineered to last." — it communicates technical depth, longevity, and care without being vague.</w:t>
       </w:r>
     </w:p>
     <w:p>
@@ -3836,7 +3834,7 @@
           <w:sz w:val="20"/>
           <w:szCs w:val="20"/>
         </w:rPr>
-        <w:t xml:space="preserve">// built to ship.</w:t>
+        <w:t xml:space="preserve">// engineered to last.          ← primary</w:t>
       </w:r>
     </w:p>
     <w:p>
@@ -3855,7 +3853,7 @@
           <w:sz w:val="20"/>
           <w:szCs w:val="20"/>
         </w:rPr>
-        <w:t xml:space="preserve">// no overhead, just output.</w:t>
+        <w:t xml:space="preserve">// code worth keeping.</w:t>
       </w:r>
     </w:p>
     <w:p>
@@ -3874,7 +3872,7 @@
           <w:sz w:val="20"/>
           <w:szCs w:val="20"/>
         </w:rPr>
-        <w:t xml:space="preserve">// your stack, your pace, my code.</w:t>
+        <w:t xml:space="preserve">// built with intent.</w:t>
       </w:r>
     </w:p>
     <w:p>
@@ -3893,7 +3891,26 @@
           <w:sz w:val="20"/>
           <w:szCs w:val="20"/>
         </w:rPr>
-        <w:t xml:space="preserve">// web applications. built right.</w:t>
+        <w:t xml:space="preserve">// own your distribution.</w:t>
+      </w:r>
+    </w:p>
+    <w:p>
+      <w:pPr>
+        <w:pBdr>
+          <w:left w:val="single" w:color="00E5B0" w:sz="12" w:space="8"/>
+        </w:pBdr>
+        <w:shd w:fill="F4F4F0" w:val="clear"/>
+        <w:spacing w:before="40" w:after="40"/>
+        <w:ind w:left="360" w:right="360"/>
+      </w:pPr>
+      <w:r>
+        <w:rPr>
+          <w:rFonts w:ascii="Courier New" w:cs="Courier New" w:eastAsia="Courier New" w:hAnsi="Courier New"/>
+          <w:color w:val="0A0A0B"/>
+          <w:sz w:val="20"/>
+          <w:szCs w:val="20"/>
+        </w:rPr>
+        <w:t xml:space="preserve">// the web is the platform.</w:t>
       </w:r>
     </w:p>
     <w:p>
@@ -3936,7 +3953,7 @@
           <w:sz w:val="22"/>
           <w:szCs w:val="22"/>
         </w:rPr>
-        <w:t xml:space="preserve">I am a web application developer working under the Forwardslash name. I build full-stack web applications — directly, without agency overhead. You get the person writing the code.</w:t>
+        <w:t xml:space="preserve">Forwardslash is a web application development practice specialising in full-stack applications and Progressive Web Apps. We build software that runs on the open web — no App Store approvals, no platform tax, no gatekeepers. You own the code, the infrastructure, and the distribution channel.</w:t>
       </w:r>
     </w:p>
     <w:p>
@@ -4310,6 +4327,131 @@
         </w:rPr>
         <w:t xml:space="preserve">07 — Brand Applications</w:t>
       </w:r>
+    </w:p>
+    <w:p>
+      <w:pPr>
+        <w:pStyle w:val="Heading2"/>
+        <w:spacing w:before="320" w:after="120"/>
+      </w:pPr>
+      <w:r>
+        <w:rPr>
+          <w:rFonts w:ascii="Arial" w:cs="Arial" w:eastAsia="Arial" w:hAnsi="Arial"/>
+          <w:b/>
+          <w:bCs/>
+          <w:color w:val="0A0A0B"/>
+          <w:sz w:val="26"/>
+          <w:szCs w:val="26"/>
+        </w:rPr>
+        <w:t xml:space="preserve">Progressive Web Apps</w:t>
+      </w:r>
+    </w:p>
+    <w:p>
+      <w:pPr>
+        <w:spacing w:before="80" w:after="120"/>
+      </w:pPr>
+      <w:r>
+        <w:rPr>
+          <w:rFonts w:ascii="Arial" w:cs="Arial" w:eastAsia="Arial" w:hAnsi="Arial"/>
+          <w:color w:val="0A0A0B"/>
+          <w:sz w:val="22"/>
+          <w:szCs w:val="22"/>
+        </w:rPr>
+        <w:t xml:space="preserve">PWA development is a core Forwardslash specialisation and should be referenced in all service descriptions. The key message: PWAs run on the open web, install directly from the browser, and require no App Store approval, platform cut, or fragmented codebase.</w:t>
+      </w:r>
+    </w:p>
+    <w:p>
+      <w:pPr>
+        <w:spacing w:before="0" w:after="0"/>
+      </w:pPr>
+    </w:p>
+    <w:p>
+      <w:pPr>
+        <w:pStyle w:val="ListParagraph"/>
+        <w:numPr>
+          <w:ilvl w:val="0"/>
+          <w:numId w:val="2"/>
+        </w:numPr>
+        <w:spacing w:before="40" w:after="60"/>
+      </w:pPr>
+      <w:r>
+        <w:rPr>
+          <w:rFonts w:ascii="Arial" w:cs="Arial" w:eastAsia="Arial" w:hAnsi="Arial"/>
+          <w:b w:val="false"/>
+          <w:bCs w:val="false"/>
+          <w:color w:val="0A0A0B"/>
+          <w:sz w:val="22"/>
+          <w:szCs w:val="22"/>
+        </w:rPr>
+        <w:t xml:space="preserve">Owned distribution — no App Store, no Google Play, no 30% cut</w:t>
+      </w:r>
+    </w:p>
+    <w:p>
+      <w:pPr>
+        <w:pStyle w:val="ListParagraph"/>
+        <w:numPr>
+          <w:ilvl w:val="0"/>
+          <w:numId w:val="2"/>
+        </w:numPr>
+        <w:spacing w:before="40" w:after="60"/>
+      </w:pPr>
+      <w:r>
+        <w:rPr>
+          <w:rFonts w:ascii="Arial" w:cs="Arial" w:eastAsia="Arial" w:hAnsi="Arial"/>
+          <w:b w:val="false"/>
+          <w:bCs w:val="false"/>
+          <w:color w:val="0A0A0B"/>
+          <w:sz w:val="22"/>
+          <w:szCs w:val="22"/>
+        </w:rPr>
+        <w:t xml:space="preserve">Single codebase for every device — desktop, mobile, tablet</w:t>
+      </w:r>
+    </w:p>
+    <w:p>
+      <w:pPr>
+        <w:pStyle w:val="ListParagraph"/>
+        <w:numPr>
+          <w:ilvl w:val="0"/>
+          <w:numId w:val="2"/>
+        </w:numPr>
+        <w:spacing w:before="40" w:after="60"/>
+      </w:pPr>
+      <w:r>
+        <w:rPr>
+          <w:rFonts w:ascii="Arial" w:cs="Arial" w:eastAsia="Arial" w:hAnsi="Arial"/>
+          <w:b w:val="false"/>
+          <w:bCs w:val="false"/>
+          <w:color w:val="0A0A0B"/>
+          <w:sz w:val="22"/>
+          <w:szCs w:val="22"/>
+        </w:rPr>
+        <w:t xml:space="preserve">Offline-capable, installable, push notifications</w:t>
+      </w:r>
+    </w:p>
+    <w:p>
+      <w:pPr>
+        <w:pStyle w:val="ListParagraph"/>
+        <w:numPr>
+          <w:ilvl w:val="0"/>
+          <w:numId w:val="2"/>
+        </w:numPr>
+        <w:spacing w:before="40" w:after="60"/>
+      </w:pPr>
+      <w:r>
+        <w:rPr>
+          <w:rFonts w:ascii="Arial" w:cs="Arial" w:eastAsia="Arial" w:hAnsi="Arial"/>
+          <w:b w:val="false"/>
+          <w:bCs w:val="false"/>
+          <w:color w:val="0A0A0B"/>
+          <w:sz w:val="22"/>
+          <w:szCs w:val="22"/>
+        </w:rPr>
+        <w:t xml:space="preserve">Silent updates — no user action required</w:t>
+      </w:r>
+    </w:p>
+    <w:p>
+      <w:pPr>
+        <w:spacing w:before="0" w:after="120"/>
+      </w:pPr>
     </w:p>
     <w:p>
       <w:pPr>
@@ -4855,7 +4997,7 @@
                 <w:sz w:val="20"/>
                 <w:szCs w:val="20"/>
               </w:rPr>
-              <w:t xml:space="preserve">Primary color</w:t>
+              <w:t xml:space="preserve">Primary tagline</w:t>
             </w:r>
           </w:p>
         </w:tc>
@@ -4878,12 +5020,12 @@
           <w:p>
             <w:r>
               <w:rPr>
-                <w:rFonts w:ascii="Courier New" w:cs="Courier New" w:eastAsia="Courier New" w:hAnsi="Courier New"/>
+                <w:rFonts w:ascii="Arial" w:cs="Arial" w:eastAsia="Arial" w:hAnsi="Arial"/>
                 <w:color w:val="0A0A0B"/>
                 <w:sz w:val="20"/>
                 <w:szCs w:val="20"/>
               </w:rPr>
-              <w:t xml:space="preserve">#00E5B0 — Signal</w:t>
+              <w:t xml:space="preserve">// engineered to last.</w:t>
             </w:r>
           </w:p>
         </w:tc>
@@ -4916,7 +5058,7 @@
                 <w:sz w:val="20"/>
                 <w:szCs w:val="20"/>
               </w:rPr>
-              <w:t xml:space="preserve">Background</w:t>
+              <w:t xml:space="preserve">Primary color</w:t>
             </w:r>
           </w:p>
         </w:tc>
@@ -4944,7 +5086,7 @@
                 <w:sz w:val="20"/>
                 <w:szCs w:val="20"/>
               </w:rPr>
-              <w:t xml:space="preserve">#0A0A0B — Void</w:t>
+              <w:t xml:space="preserve">#00E5B0 — Signal</w:t>
             </w:r>
           </w:p>
         </w:tc>
@@ -4977,7 +5119,7 @@
                 <w:sz w:val="20"/>
                 <w:szCs w:val="20"/>
               </w:rPr>
-              <w:t xml:space="preserve">Light surface</w:t>
+              <w:t xml:space="preserve">Background</w:t>
             </w:r>
           </w:p>
         </w:tc>
@@ -5005,7 +5147,7 @@
                 <w:sz w:val="20"/>
                 <w:szCs w:val="20"/>
               </w:rPr>
-              <w:t xml:space="preserve">#F0EEE8 — Parchment</w:t>
+              <w:t xml:space="preserve">#0A0A0B — Void</w:t>
             </w:r>
           </w:p>
         </w:tc>
@@ -5038,7 +5180,7 @@
                 <w:sz w:val="20"/>
                 <w:szCs w:val="20"/>
               </w:rPr>
-              <w:t xml:space="preserve">Display typeface</w:t>
+              <w:t xml:space="preserve">Light surface</w:t>
             </w:r>
           </w:p>
         </w:tc>
@@ -5061,12 +5203,12 @@
           <w:p>
             <w:r>
               <w:rPr>
-                <w:rFonts w:ascii="Arial" w:cs="Arial" w:eastAsia="Arial" w:hAnsi="Arial"/>
+                <w:rFonts w:ascii="Courier New" w:cs="Courier New" w:eastAsia="Courier New" w:hAnsi="Courier New"/>
                 <w:color w:val="0A0A0B"/>
                 <w:sz w:val="20"/>
                 <w:szCs w:val="20"/>
               </w:rPr>
-              <w:t xml:space="preserve">Space Mono (Bold 700 / Regular 400)</w:t>
+              <w:t xml:space="preserve">#F0EEE8 — Parchment</w:t>
             </w:r>
           </w:p>
         </w:tc>
@@ -5099,7 +5241,7 @@
                 <w:sz w:val="20"/>
                 <w:szCs w:val="20"/>
               </w:rPr>
-              <w:t xml:space="preserve">Body typeface</w:t>
+              <w:t xml:space="preserve">Display typeface</w:t>
             </w:r>
           </w:p>
         </w:tc>
@@ -5127,7 +5269,7 @@
                 <w:sz w:val="20"/>
                 <w:szCs w:val="20"/>
               </w:rPr>
-              <w:t xml:space="preserve">DM Sans (Light 300 / Regular 400 / Medium 500)</w:t>
+              <w:t xml:space="preserve">Space Mono (Bold 700 / Regular 400)</w:t>
             </w:r>
           </w:p>
         </w:tc>
@@ -5160,7 +5302,7 @@
                 <w:sz w:val="20"/>
                 <w:szCs w:val="20"/>
               </w:rPr>
-              <w:t xml:space="preserve">Domain</w:t>
+              <w:t xml:space="preserve">Body typeface</w:t>
             </w:r>
           </w:p>
         </w:tc>
@@ -5183,12 +5325,12 @@
           <w:p>
             <w:r>
               <w:rPr>
-                <w:rFonts w:ascii="Courier New" w:cs="Courier New" w:eastAsia="Courier New" w:hAnsi="Courier New"/>
+                <w:rFonts w:ascii="Arial" w:cs="Arial" w:eastAsia="Arial" w:hAnsi="Arial"/>
                 <w:color w:val="0A0A0B"/>
                 <w:sz w:val="20"/>
                 <w:szCs w:val="20"/>
               </w:rPr>
-              <w:t xml:space="preserve">https://forwardslash.dev</w:t>
+              <w:t xml:space="preserve">DM Sans (Light 300 / Regular 400 / Medium 500)</w:t>
             </w:r>
           </w:p>
         </w:tc>
@@ -5221,7 +5363,7 @@
                 <w:sz w:val="20"/>
                 <w:szCs w:val="20"/>
               </w:rPr>
-              <w:t xml:space="preserve">Tagline format</w:t>
+              <w:t xml:space="preserve">Domain</w:t>
             </w:r>
           </w:p>
         </w:tc>
@@ -5249,7 +5391,190 @@
                 <w:sz w:val="20"/>
                 <w:szCs w:val="20"/>
               </w:rPr>
+              <w:t xml:space="preserve">https://forwardslash.dev</w:t>
+            </w:r>
+          </w:p>
+        </w:tc>
+      </w:tr>
+      <w:tr>
+        <w:tc>
+          <w:tcPr>
+            <w:tcW w:type="dxa" w:w="3000"/>
+            <w:tcBorders>
+              <w:top w:val="single" w:color="CCCCCC" w:sz="4"/>
+              <w:left w:val="single" w:color="CCCCCC" w:sz="4"/>
+              <w:bottom w:val="single" w:color="CCCCCC" w:sz="4"/>
+              <w:right w:val="single" w:color="CCCCCC" w:sz="4"/>
+            </w:tcBorders>
+            <w:shd w:fill="F4F4F0" w:val="clear"/>
+            <w:tcMar>
+              <w:top w:type="dxa" w:w="80"/>
+              <w:left w:type="dxa" w:w="120"/>
+              <w:bottom w:type="dxa" w:w="80"/>
+              <w:right w:type="dxa" w:w="120"/>
+            </w:tcMar>
+          </w:tcPr>
+          <w:p>
+            <w:r>
+              <w:rPr>
+                <w:rFonts w:ascii="Arial" w:cs="Arial" w:eastAsia="Arial" w:hAnsi="Arial"/>
+                <w:b/>
+                <w:bCs/>
+                <w:color w:val="0A0A0B"/>
+                <w:sz w:val="20"/>
+                <w:szCs w:val="20"/>
+              </w:rPr>
+              <w:t xml:space="preserve">Pronoun voice</w:t>
+            </w:r>
+          </w:p>
+        </w:tc>
+        <w:tc>
+          <w:tcPr>
+            <w:tcW w:type="dxa" w:w="6200"/>
+            <w:tcBorders>
+              <w:top w:val="single" w:color="CCCCCC" w:sz="4"/>
+              <w:left w:val="single" w:color="CCCCCC" w:sz="4"/>
+              <w:bottom w:val="single" w:color="CCCCCC" w:sz="4"/>
+              <w:right w:val="single" w:color="CCCCCC" w:sz="4"/>
+            </w:tcBorders>
+            <w:tcMar>
+              <w:top w:type="dxa" w:w="80"/>
+              <w:left w:type="dxa" w:w="120"/>
+              <w:bottom w:type="dxa" w:w="80"/>
+              <w:right w:type="dxa" w:w="120"/>
+            </w:tcMar>
+          </w:tcPr>
+          <w:p>
+            <w:r>
+              <w:rPr>
+                <w:rFonts w:ascii="Arial" w:cs="Arial" w:eastAsia="Arial" w:hAnsi="Arial"/>
+                <w:color w:val="0A0A0B"/>
+                <w:sz w:val="20"/>
+                <w:szCs w:val="20"/>
+              </w:rPr>
+              <w:t xml:space="preserve">We / our — studio voice throughout</w:t>
+            </w:r>
+          </w:p>
+        </w:tc>
+      </w:tr>
+      <w:tr>
+        <w:tc>
+          <w:tcPr>
+            <w:tcW w:type="dxa" w:w="3000"/>
+            <w:tcBorders>
+              <w:top w:val="single" w:color="CCCCCC" w:sz="4"/>
+              <w:left w:val="single" w:color="CCCCCC" w:sz="4"/>
+              <w:bottom w:val="single" w:color="CCCCCC" w:sz="4"/>
+              <w:right w:val="single" w:color="CCCCCC" w:sz="4"/>
+            </w:tcBorders>
+            <w:shd w:fill="F4F4F0" w:val="clear"/>
+            <w:tcMar>
+              <w:top w:type="dxa" w:w="80"/>
+              <w:left w:type="dxa" w:w="120"/>
+              <w:bottom w:type="dxa" w:w="80"/>
+              <w:right w:type="dxa" w:w="120"/>
+            </w:tcMar>
+          </w:tcPr>
+          <w:p>
+            <w:r>
+              <w:rPr>
+                <w:rFonts w:ascii="Arial" w:cs="Arial" w:eastAsia="Arial" w:hAnsi="Arial"/>
+                <w:b/>
+                <w:bCs/>
+                <w:color w:val="0A0A0B"/>
+                <w:sz w:val="20"/>
+                <w:szCs w:val="20"/>
+              </w:rPr>
+              <w:t xml:space="preserve">Tagline format</w:t>
+            </w:r>
+          </w:p>
+        </w:tc>
+        <w:tc>
+          <w:tcPr>
+            <w:tcW w:type="dxa" w:w="6200"/>
+            <w:tcBorders>
+              <w:top w:val="single" w:color="CCCCCC" w:sz="4"/>
+              <w:left w:val="single" w:color="CCCCCC" w:sz="4"/>
+              <w:bottom w:val="single" w:color="CCCCCC" w:sz="4"/>
+              <w:right w:val="single" w:color="CCCCCC" w:sz="4"/>
+            </w:tcBorders>
+            <w:tcMar>
+              <w:top w:type="dxa" w:w="80"/>
+              <w:left w:type="dxa" w:w="120"/>
+              <w:bottom w:type="dxa" w:w="80"/>
+              <w:right w:type="dxa" w:w="120"/>
+            </w:tcMar>
+          </w:tcPr>
+          <w:p>
+            <w:r>
+              <w:rPr>
+                <w:rFonts w:ascii="Courier New" w:cs="Courier New" w:eastAsia="Courier New" w:hAnsi="Courier New"/>
+                <w:color w:val="0A0A0B"/>
+                <w:sz w:val="20"/>
+                <w:szCs w:val="20"/>
+              </w:rPr>
               <w:t xml:space="preserve">// [short statement, lowercase, period]</w:t>
+            </w:r>
+          </w:p>
+        </w:tc>
+      </w:tr>
+      <w:tr>
+        <w:tc>
+          <w:tcPr>
+            <w:tcW w:type="dxa" w:w="3000"/>
+            <w:tcBorders>
+              <w:top w:val="single" w:color="CCCCCC" w:sz="4"/>
+              <w:left w:val="single" w:color="CCCCCC" w:sz="4"/>
+              <w:bottom w:val="single" w:color="CCCCCC" w:sz="4"/>
+              <w:right w:val="single" w:color="CCCCCC" w:sz="4"/>
+            </w:tcBorders>
+            <w:shd w:fill="F4F4F0" w:val="clear"/>
+            <w:tcMar>
+              <w:top w:type="dxa" w:w="80"/>
+              <w:left w:type="dxa" w:w="120"/>
+              <w:bottom w:type="dxa" w:w="80"/>
+              <w:right w:type="dxa" w:w="120"/>
+            </w:tcMar>
+          </w:tcPr>
+          <w:p>
+            <w:r>
+              <w:rPr>
+                <w:rFonts w:ascii="Arial" w:cs="Arial" w:eastAsia="Arial" w:hAnsi="Arial"/>
+                <w:b/>
+                <w:bCs/>
+                <w:color w:val="0A0A0B"/>
+                <w:sz w:val="20"/>
+                <w:szCs w:val="20"/>
+              </w:rPr>
+              <w:t xml:space="preserve">Specialisation</w:t>
+            </w:r>
+          </w:p>
+        </w:tc>
+        <w:tc>
+          <w:tcPr>
+            <w:tcW w:type="dxa" w:w="6200"/>
+            <w:tcBorders>
+              <w:top w:val="single" w:color="CCCCCC" w:sz="4"/>
+              <w:left w:val="single" w:color="CCCCCC" w:sz="4"/>
+              <w:bottom w:val="single" w:color="CCCCCC" w:sz="4"/>
+              <w:right w:val="single" w:color="CCCCCC" w:sz="4"/>
+            </w:tcBorders>
+            <w:tcMar>
+              <w:top w:type="dxa" w:w="80"/>
+              <w:left w:type="dxa" w:w="120"/>
+              <w:bottom w:type="dxa" w:w="80"/>
+              <w:right w:type="dxa" w:w="120"/>
+            </w:tcMar>
+          </w:tcPr>
+          <w:p>
+            <w:r>
+              <w:rPr>
+                <w:rFonts w:ascii="Arial" w:cs="Arial" w:eastAsia="Arial" w:hAnsi="Arial"/>
+                <w:color w:val="0A0A0B"/>
+                <w:sz w:val="20"/>
+                <w:szCs w:val="20"/>
+              </w:rPr>
+              <w:t xml:space="preserve">PWA &amp; full-stack web applications</w:t>
             </w:r>
           </w:p>
         </w:tc>

</xml_diff>